<commit_message>
Adds datasheet, documentation, and test files
Introduces relevant hardware datasheets and new documentation files to support project development. Includes a new test case for further validation and several temp files likely associated with active document editing.
</commit_message>
<xml_diff>
--- a/dino/docs/final/Dino_Wiring_555_PC_Part_1.docx
+++ b/dino/docs/final/Dino_Wiring_555_PC_Part_1.docx
@@ -4,20 +4,20 @@
   <w:body>
     <w:p>
       <w:pPr>
-        <w:pStyle w:val="FirstParagraph"/>
-      </w:pPr>
-      <w:r>
-        <w:rPr>
-          <w:b/>
-          <w:bCs/>
-        </w:rPr>
-        <w:t>DINO v0.0.1 Wiring and Debug Summary</w:t>
-      </w:r>
-      <w:r>
-        <w:rPr>
-          <w:b/>
-          <w:bCs/>
-        </w:rPr>
+        <w:pStyle w:val="Title"/>
+      </w:pPr>
+      <w:r>
+        <w:t xml:space="preserve">DINO v0.0.1 </w:t>
+      </w:r>
+    </w:p>
+    <w:p>
+      <w:pPr>
+        <w:pStyle w:val="Subtitle"/>
+      </w:pPr>
+      <w:r>
+        <w:t>Wiring and Debug Summary</w:t>
+      </w:r>
+      <w:r>
         <w:t xml:space="preserve"> – June 22, 2025</w:t>
       </w:r>
     </w:p>

</xml_diff>